<commit_message>
docs: replace Nexi references with Peytech
</commit_message>
<xml_diff>
--- a/artifacts/m24shams/M24SHAMS_RUN_SHEET_STAGING_DATAGUARD.docx
+++ b/artifacts/m24shams/M24SHAMS_RUN_SHEET_STAGING_DATAGUARD.docx
@@ -4024,7 +4024,7 @@
     <w:link w:val="Heading1Char"/>
     <w:uiPriority w:val="9"/>
     <w:qFormat/>
-    <w:rsid w:val="00695EAF"/>
+    <w:rsid w:val="00FD181B"/>
     <w:pPr>
       <w:keepNext/>
       <w:keepLines/>
@@ -4046,7 +4046,7 @@
     <w:uiPriority w:val="9"/>
     <w:unhideWhenUsed/>
     <w:qFormat/>
-    <w:rsid w:val="00695EAF"/>
+    <w:rsid w:val="00FD181B"/>
     <w:pPr>
       <w:keepNext/>
       <w:keepLines/>
@@ -4069,7 +4069,7 @@
     <w:semiHidden/>
     <w:unhideWhenUsed/>
     <w:qFormat/>
-    <w:rsid w:val="00695EAF"/>
+    <w:rsid w:val="00FD181B"/>
     <w:pPr>
       <w:keepNext/>
       <w:keepLines/>
@@ -4092,7 +4092,7 @@
     <w:semiHidden/>
     <w:unhideWhenUsed/>
     <w:qFormat/>
-    <w:rsid w:val="00695EAF"/>
+    <w:rsid w:val="00FD181B"/>
     <w:pPr>
       <w:keepNext/>
       <w:keepLines/>
@@ -4115,7 +4115,7 @@
     <w:semiHidden/>
     <w:unhideWhenUsed/>
     <w:qFormat/>
-    <w:rsid w:val="00695EAF"/>
+    <w:rsid w:val="00FD181B"/>
     <w:pPr>
       <w:keepNext/>
       <w:keepLines/>
@@ -4136,7 +4136,7 @@
     <w:semiHidden/>
     <w:unhideWhenUsed/>
     <w:qFormat/>
-    <w:rsid w:val="00695EAF"/>
+    <w:rsid w:val="00FD181B"/>
     <w:pPr>
       <w:keepNext/>
       <w:keepLines/>
@@ -4159,7 +4159,7 @@
     <w:semiHidden/>
     <w:unhideWhenUsed/>
     <w:qFormat/>
-    <w:rsid w:val="00695EAF"/>
+    <w:rsid w:val="00FD181B"/>
     <w:pPr>
       <w:keepNext/>
       <w:keepLines/>
@@ -4180,7 +4180,7 @@
     <w:semiHidden/>
     <w:unhideWhenUsed/>
     <w:qFormat/>
-    <w:rsid w:val="00695EAF"/>
+    <w:rsid w:val="00FD181B"/>
     <w:pPr>
       <w:keepNext/>
       <w:keepLines/>
@@ -4203,7 +4203,7 @@
     <w:semiHidden/>
     <w:unhideWhenUsed/>
     <w:qFormat/>
-    <w:rsid w:val="00695EAF"/>
+    <w:rsid w:val="00FD181B"/>
     <w:pPr>
       <w:keepNext/>
       <w:keepLines/>
@@ -4247,7 +4247,7 @@
     <w:basedOn w:val="DefaultParagraphFont"/>
     <w:link w:val="Heading1"/>
     <w:uiPriority w:val="9"/>
-    <w:rsid w:val="00695EAF"/>
+    <w:rsid w:val="00FD181B"/>
     <w:rPr>
       <w:rFonts w:ascii="Aptos Display" w:eastAsiaTheme="majorEastAsia" w:hAnsi="Aptos Display" w:cstheme="majorBidi"/>
       <w:color w:val="003B75"/>
@@ -4260,7 +4260,7 @@
     <w:basedOn w:val="DefaultParagraphFont"/>
     <w:link w:val="Heading2"/>
     <w:uiPriority w:val="9"/>
-    <w:rsid w:val="00695EAF"/>
+    <w:rsid w:val="00FD181B"/>
     <w:rPr>
       <w:rFonts w:ascii="Aptos Display" w:eastAsiaTheme="majorEastAsia" w:hAnsi="Aptos Display" w:cstheme="majorBidi"/>
       <w:color w:val="003B75"/>
@@ -4273,7 +4273,7 @@
     <w:link w:val="Heading3"/>
     <w:uiPriority w:val="9"/>
     <w:semiHidden/>
-    <w:rsid w:val="00695EAF"/>
+    <w:rsid w:val="00FD181B"/>
     <w:rPr>
       <w:rFonts w:ascii="Aptos Display" w:eastAsiaTheme="majorEastAsia" w:hAnsi="Aptos Display" w:cstheme="majorBidi"/>
       <w:color w:val="003B75"/>
@@ -4287,7 +4287,7 @@
     <w:link w:val="Heading4"/>
     <w:uiPriority w:val="9"/>
     <w:semiHidden/>
-    <w:rsid w:val="00695EAF"/>
+    <w:rsid w:val="00FD181B"/>
     <w:rPr>
       <w:rFonts w:eastAsiaTheme="majorEastAsia" w:cstheme="majorBidi"/>
       <w:i/>
@@ -4301,7 +4301,7 @@
     <w:link w:val="Heading5"/>
     <w:uiPriority w:val="9"/>
     <w:semiHidden/>
-    <w:rsid w:val="00695EAF"/>
+    <w:rsid w:val="00FD181B"/>
     <w:rPr>
       <w:rFonts w:eastAsiaTheme="majorEastAsia" w:cstheme="majorBidi"/>
       <w:color w:val="0F4761" w:themeColor="accent1" w:themeShade="BF"/>
@@ -4313,7 +4313,7 @@
     <w:link w:val="Heading6"/>
     <w:uiPriority w:val="9"/>
     <w:semiHidden/>
-    <w:rsid w:val="00695EAF"/>
+    <w:rsid w:val="00FD181B"/>
     <w:rPr>
       <w:rFonts w:eastAsiaTheme="majorEastAsia" w:cstheme="majorBidi"/>
       <w:i/>
@@ -4327,7 +4327,7 @@
     <w:link w:val="Heading7"/>
     <w:uiPriority w:val="9"/>
     <w:semiHidden/>
-    <w:rsid w:val="00695EAF"/>
+    <w:rsid w:val="00FD181B"/>
     <w:rPr>
       <w:rFonts w:eastAsiaTheme="majorEastAsia" w:cstheme="majorBidi"/>
       <w:color w:val="595959" w:themeColor="text1" w:themeTint="A6"/>
@@ -4339,7 +4339,7 @@
     <w:link w:val="Heading8"/>
     <w:uiPriority w:val="9"/>
     <w:semiHidden/>
-    <w:rsid w:val="00695EAF"/>
+    <w:rsid w:val="00FD181B"/>
     <w:rPr>
       <w:rFonts w:eastAsiaTheme="majorEastAsia" w:cstheme="majorBidi"/>
       <w:i/>
@@ -4353,7 +4353,7 @@
     <w:link w:val="Heading9"/>
     <w:uiPriority w:val="9"/>
     <w:semiHidden/>
-    <w:rsid w:val="00695EAF"/>
+    <w:rsid w:val="00FD181B"/>
     <w:rPr>
       <w:rFonts w:eastAsiaTheme="majorEastAsia" w:cstheme="majorBidi"/>
       <w:color w:val="272727" w:themeColor="text1" w:themeTint="D8"/>
@@ -4366,7 +4366,7 @@
     <w:link w:val="TitleChar"/>
     <w:uiPriority w:val="10"/>
     <w:qFormat/>
-    <w:rsid w:val="00695EAF"/>
+    <w:rsid w:val="00FD181B"/>
     <w:pPr>
       <w:spacing w:before="120" w:line="240" w:lineRule="auto"/>
       <w:contextualSpacing/>
@@ -4385,7 +4385,7 @@
     <w:basedOn w:val="DefaultParagraphFont"/>
     <w:link w:val="Title"/>
     <w:uiPriority w:val="10"/>
-    <w:rsid w:val="00695EAF"/>
+    <w:rsid w:val="00FD181B"/>
     <w:rPr>
       <w:rFonts w:ascii="Aptos Display" w:eastAsiaTheme="majorEastAsia" w:hAnsi="Aptos Display" w:cstheme="majorBidi"/>
       <w:color w:val="003B75"/>
@@ -4402,7 +4402,7 @@
     <w:link w:val="SubtitleChar"/>
     <w:uiPriority w:val="11"/>
     <w:qFormat/>
-    <w:rsid w:val="00695EAF"/>
+    <w:rsid w:val="00FD181B"/>
     <w:pPr>
       <w:numPr>
         <w:ilvl w:val="1"/>
@@ -4421,7 +4421,7 @@
     <w:basedOn w:val="DefaultParagraphFont"/>
     <w:link w:val="Subtitle"/>
     <w:uiPriority w:val="11"/>
-    <w:rsid w:val="00695EAF"/>
+    <w:rsid w:val="00FD181B"/>
     <w:rPr>
       <w:rFonts w:eastAsiaTheme="majorEastAsia" w:cstheme="majorBidi"/>
       <w:color w:val="595959" w:themeColor="text1" w:themeTint="A6"/>
@@ -4437,7 +4437,7 @@
     <w:link w:val="QuoteChar"/>
     <w:uiPriority w:val="29"/>
     <w:qFormat/>
-    <w:rsid w:val="00695EAF"/>
+    <w:rsid w:val="00FD181B"/>
     <w:pPr>
       <w:spacing w:before="160"/>
       <w:jc w:val="center"/>
@@ -4453,7 +4453,7 @@
     <w:basedOn w:val="DefaultParagraphFont"/>
     <w:link w:val="Quote"/>
     <w:uiPriority w:val="29"/>
-    <w:rsid w:val="00695EAF"/>
+    <w:rsid w:val="00FD181B"/>
     <w:rPr>
       <w:i/>
       <w:iCs/>
@@ -4465,7 +4465,7 @@
     <w:basedOn w:val="Normal"/>
     <w:uiPriority w:val="34"/>
     <w:qFormat/>
-    <w:rsid w:val="00695EAF"/>
+    <w:rsid w:val="00FD181B"/>
     <w:pPr>
       <w:ind w:left="720"/>
       <w:contextualSpacing/>
@@ -4476,7 +4476,7 @@
     <w:basedOn w:val="DefaultParagraphFont"/>
     <w:uiPriority w:val="21"/>
     <w:qFormat/>
-    <w:rsid w:val="00695EAF"/>
+    <w:rsid w:val="00FD181B"/>
     <w:rPr>
       <w:i/>
       <w:iCs/>
@@ -4490,7 +4490,7 @@
     <w:link w:val="IntenseQuoteChar"/>
     <w:uiPriority w:val="30"/>
     <w:qFormat/>
-    <w:rsid w:val="00695EAF"/>
+    <w:rsid w:val="00FD181B"/>
     <w:pPr>
       <w:pBdr>
         <w:top w:val="single" w:sz="4" w:space="10" w:color="0F4761" w:themeColor="accent1" w:themeShade="BF"/>
@@ -4511,7 +4511,7 @@
     <w:basedOn w:val="DefaultParagraphFont"/>
     <w:link w:val="IntenseQuote"/>
     <w:uiPriority w:val="30"/>
-    <w:rsid w:val="00695EAF"/>
+    <w:rsid w:val="00FD181B"/>
     <w:rPr>
       <w:i/>
       <w:iCs/>
@@ -4523,7 +4523,7 @@
     <w:basedOn w:val="DefaultParagraphFont"/>
     <w:uiPriority w:val="32"/>
     <w:qFormat/>
-    <w:rsid w:val="00695EAF"/>
+    <w:rsid w:val="00FD181B"/>
     <w:rPr>
       <w:b/>
       <w:bCs/>
@@ -4538,7 +4538,7 @@
     <w:link w:val="HeaderChar"/>
     <w:uiPriority w:val="99"/>
     <w:unhideWhenUsed/>
-    <w:rsid w:val="00695EAF"/>
+    <w:rsid w:val="00FD181B"/>
     <w:pPr>
       <w:tabs>
         <w:tab w:val="center" w:pos="4513"/>
@@ -4552,7 +4552,7 @@
     <w:basedOn w:val="DefaultParagraphFont"/>
     <w:link w:val="Header"/>
     <w:uiPriority w:val="99"/>
-    <w:rsid w:val="00695EAF"/>
+    <w:rsid w:val="00FD181B"/>
     <w:rPr>
       <w:rFonts w:ascii="Aptos" w:hAnsi="Aptos"/>
       <w:sz w:val="18"/>
@@ -4564,7 +4564,7 @@
     <w:link w:val="FooterChar"/>
     <w:uiPriority w:val="99"/>
     <w:unhideWhenUsed/>
-    <w:rsid w:val="00695EAF"/>
+    <w:rsid w:val="00FD181B"/>
     <w:pPr>
       <w:tabs>
         <w:tab w:val="center" w:pos="4513"/>
@@ -4578,7 +4578,7 @@
     <w:basedOn w:val="DefaultParagraphFont"/>
     <w:link w:val="Footer"/>
     <w:uiPriority w:val="99"/>
-    <w:rsid w:val="00695EAF"/>
+    <w:rsid w:val="00FD181B"/>
     <w:rPr>
       <w:rFonts w:ascii="Aptos" w:hAnsi="Aptos"/>
       <w:sz w:val="18"/>
@@ -4588,7 +4588,7 @@
     <w:name w:val="Table Grid"/>
     <w:basedOn w:val="TableNormal"/>
     <w:uiPriority w:val="39"/>
-    <w:rsid w:val="00695EAF"/>
+    <w:rsid w:val="00FD181B"/>
     <w:pPr>
       <w:spacing w:after="0" w:line="240" w:lineRule="auto"/>
     </w:pPr>

</xml_diff>